<commit_message>
limpieza de archivos basura
</commit_message>
<xml_diff>
--- a/Documentación de SGPC.docx
+++ b/Documentación de SGPC.docx
@@ -1061,21 +1061,7 @@
                 <w:rStyle w:val="Hipervnculo"/>
                 <w:noProof/>
               </w:rPr>
-              <w:t>Introducc</w:t>
-            </w:r>
-            <w:r>
-              <w:rPr>
-                <w:rStyle w:val="Hipervnculo"/>
-                <w:noProof/>
-              </w:rPr>
-              <w:t>i</w:t>
-            </w:r>
-            <w:r>
-              <w:rPr>
-                <w:rStyle w:val="Hipervnculo"/>
-                <w:noProof/>
-              </w:rPr>
-              <w:t>ón</w:t>
+              <w:t>Introducción</w:t>
             </w:r>
             <w:r>
               <w:rPr>
@@ -1784,15 +1770,7 @@
       </w:pPr>
       <w:bookmarkStart w:id="1" w:name="_Toc223349597"/>
       <w:r>
-        <w:t xml:space="preserve">Selección del </w:t>
-      </w:r>
-      <w:proofErr w:type="spellStart"/>
-      <w:r>
-        <w:t>stack</w:t>
-      </w:r>
-      <w:proofErr w:type="spellEnd"/>
-      <w:r>
-        <w:t xml:space="preserve"> tecnológico</w:t>
+        <w:t>Selección del stack tecnológico</w:t>
       </w:r>
       <w:bookmarkEnd w:id="1"/>
     </w:p>
@@ -1947,39 +1925,51 @@
                 <w:szCs w:val="24"/>
               </w:rPr>
             </w:pPr>
-            <w:proofErr w:type="spellStart"/>
             <w:r>
               <w:rPr>
                 <w:sz w:val="24"/>
                 <w:szCs w:val="24"/>
               </w:rPr>
-              <w:t>React</w:t>
-            </w:r>
-            <w:proofErr w:type="spellEnd"/>
-            <w:r>
+              <w:t>React + Tailwind CSS (Para el diseño sutil y minimalista)</w:t>
+            </w:r>
+          </w:p>
+          <w:p>
+            <w:pPr>
+              <w:jc w:val="center"/>
               <w:rPr>
                 <w:sz w:val="24"/>
                 <w:szCs w:val="24"/>
               </w:rPr>
-              <w:t xml:space="preserve"> + </w:t>
-            </w:r>
-            <w:proofErr w:type="spellStart"/>
-            <w:r>
+            </w:pPr>
+          </w:p>
+        </w:tc>
+      </w:tr>
+      <w:tr>
+        <w:tc>
+          <w:tcPr>
+            <w:tcW w:w="4414" w:type="dxa"/>
+          </w:tcPr>
+          <w:p>
+            <w:pPr>
+              <w:jc w:val="center"/>
               <w:rPr>
                 <w:sz w:val="24"/>
                 <w:szCs w:val="24"/>
               </w:rPr>
-              <w:t>Tailwind</w:t>
-            </w:r>
-            <w:proofErr w:type="spellEnd"/>
+            </w:pPr>
             <w:r>
               <w:rPr>
                 <w:sz w:val="24"/>
                 <w:szCs w:val="24"/>
               </w:rPr>
-              <w:t xml:space="preserve"> CSS (Para el diseño sutil y minimalista)</w:t>
-            </w:r>
-          </w:p>
+              <w:t>Backend</w:t>
+            </w:r>
+          </w:p>
+        </w:tc>
+        <w:tc>
+          <w:tcPr>
+            <w:tcW w:w="4414" w:type="dxa"/>
+          </w:tcPr>
           <w:p>
             <w:pPr>
               <w:jc w:val="center"/>
@@ -1988,6 +1978,22 @@
                 <w:szCs w:val="24"/>
               </w:rPr>
             </w:pPr>
+            <w:r>
+              <w:rPr>
+                <w:sz w:val="24"/>
+                <w:szCs w:val="24"/>
+              </w:rPr>
+              <w:t>Node.js + Express</w:t>
+            </w:r>
+          </w:p>
+          <w:p>
+            <w:pPr>
+              <w:jc w:val="center"/>
+              <w:rPr>
+                <w:sz w:val="24"/>
+                <w:szCs w:val="24"/>
+              </w:rPr>
+            </w:pPr>
           </w:p>
         </w:tc>
       </w:tr>
@@ -2004,15 +2010,13 @@
                 <w:szCs w:val="24"/>
               </w:rPr>
             </w:pPr>
-            <w:proofErr w:type="spellStart"/>
             <w:r>
               <w:rPr>
                 <w:sz w:val="24"/>
                 <w:szCs w:val="24"/>
               </w:rPr>
-              <w:t>Backend</w:t>
-            </w:r>
-            <w:proofErr w:type="spellEnd"/>
+              <w:t>Base de Datos</w:t>
+            </w:r>
           </w:p>
         </w:tc>
         <w:tc>
@@ -2032,7 +2036,7 @@
                 <w:sz w:val="24"/>
                 <w:szCs w:val="24"/>
               </w:rPr>
-              <w:t>Node.js + Express</w:t>
+              <w:t>MySQL (Gestionada vía Docker)</w:t>
             </w:r>
           </w:p>
           <w:p>
@@ -2064,7 +2068,7 @@
                 <w:sz w:val="24"/>
                 <w:szCs w:val="24"/>
               </w:rPr>
-              <w:t>Base de Datos</w:t>
+              <w:t>Contenedores</w:t>
             </w:r>
           </w:p>
         </w:tc>
@@ -2085,70 +2089,8 @@
                 <w:sz w:val="24"/>
                 <w:szCs w:val="24"/>
               </w:rPr>
-              <w:t>MySQL (Gestionada vía Docker)</w:t>
-            </w:r>
-          </w:p>
-          <w:p>
-            <w:pPr>
-              <w:jc w:val="center"/>
-              <w:rPr>
-                <w:sz w:val="24"/>
-                <w:szCs w:val="24"/>
-              </w:rPr>
-            </w:pPr>
-          </w:p>
-        </w:tc>
-      </w:tr>
-      <w:tr>
-        <w:tc>
-          <w:tcPr>
-            <w:tcW w:w="4414" w:type="dxa"/>
-          </w:tcPr>
-          <w:p>
-            <w:pPr>
-              <w:jc w:val="center"/>
-              <w:rPr>
-                <w:sz w:val="24"/>
-                <w:szCs w:val="24"/>
-              </w:rPr>
-            </w:pPr>
-            <w:r>
-              <w:rPr>
-                <w:sz w:val="24"/>
-                <w:szCs w:val="24"/>
-              </w:rPr>
-              <w:t>Contenedores</w:t>
-            </w:r>
-          </w:p>
-        </w:tc>
-        <w:tc>
-          <w:tcPr>
-            <w:tcW w:w="4414" w:type="dxa"/>
-          </w:tcPr>
-          <w:p>
-            <w:pPr>
-              <w:jc w:val="center"/>
-              <w:rPr>
-                <w:sz w:val="24"/>
-                <w:szCs w:val="24"/>
-              </w:rPr>
-            </w:pPr>
-            <w:r>
-              <w:rPr>
-                <w:sz w:val="24"/>
-                <w:szCs w:val="24"/>
-              </w:rPr>
-              <w:t xml:space="preserve">Docker &amp; Docker </w:t>
-            </w:r>
-            <w:proofErr w:type="spellStart"/>
-            <w:r>
-              <w:rPr>
-                <w:sz w:val="24"/>
-                <w:szCs w:val="24"/>
-              </w:rPr>
-              <w:t>Compose</w:t>
-            </w:r>
-            <w:proofErr w:type="spellEnd"/>
+              <w:t>Docker &amp; Docker Compose</w:t>
+            </w:r>
           </w:p>
           <w:p>
             <w:pPr>
@@ -2201,6 +2143,7 @@
       </w:pPr>
       <w:r>
         <w:rPr>
+          <w:noProof/>
           <w:sz w:val="24"/>
           <w:szCs w:val="24"/>
         </w:rPr>
@@ -2285,33 +2228,8 @@
           <w:rStyle w:val="citation-63"/>
           <w:rFonts w:asciiTheme="minorHAnsi" w:eastAsiaTheme="majorEastAsia" w:hAnsiTheme="minorHAnsi" w:cstheme="minorHAnsi"/>
         </w:rPr>
-        <w:t>Cursor/</w:t>
+        <w:t>Cursor/VsCode/Antigravity</w:t>
       </w:r>
-      <w:proofErr w:type="spellStart"/>
-      <w:r>
-        <w:rPr>
-          <w:rStyle w:val="citation-63"/>
-          <w:rFonts w:asciiTheme="minorHAnsi" w:eastAsiaTheme="majorEastAsia" w:hAnsiTheme="minorHAnsi" w:cstheme="minorHAnsi"/>
-        </w:rPr>
-        <w:t>VsCode</w:t>
-      </w:r>
-      <w:proofErr w:type="spellEnd"/>
-      <w:r>
-        <w:rPr>
-          <w:rStyle w:val="citation-63"/>
-          <w:rFonts w:asciiTheme="minorHAnsi" w:eastAsiaTheme="majorEastAsia" w:hAnsiTheme="minorHAnsi" w:cstheme="minorHAnsi"/>
-        </w:rPr>
-        <w:t>/</w:t>
-      </w:r>
-      <w:proofErr w:type="spellStart"/>
-      <w:r>
-        <w:rPr>
-          <w:rStyle w:val="citation-63"/>
-          <w:rFonts w:asciiTheme="minorHAnsi" w:eastAsiaTheme="majorEastAsia" w:hAnsiTheme="minorHAnsi" w:cstheme="minorHAnsi"/>
-        </w:rPr>
-        <w:t>Antigravity</w:t>
-      </w:r>
-      <w:proofErr w:type="spellEnd"/>
       <w:r>
         <w:rPr>
           <w:rStyle w:val="citation-63"/>
@@ -2482,7 +2400,6 @@
           <w:rFonts w:asciiTheme="minorHAnsi" w:hAnsiTheme="minorHAnsi" w:cstheme="minorHAnsi"/>
         </w:rPr>
       </w:pPr>
-      <w:proofErr w:type="spellStart"/>
       <w:r>
         <w:rPr>
           <w:rStyle w:val="citation-59"/>
@@ -2490,17 +2407,7 @@
           <w:b/>
           <w:bCs/>
         </w:rPr>
-        <w:t>Backend</w:t>
-      </w:r>
-      <w:proofErr w:type="spellEnd"/>
-      <w:r>
-        <w:rPr>
-          <w:rStyle w:val="citation-59"/>
-          <w:rFonts w:asciiTheme="minorHAnsi" w:hAnsiTheme="minorHAnsi" w:cstheme="minorHAnsi"/>
-          <w:b/>
-          <w:bCs/>
-        </w:rPr>
-        <w:t>:</w:t>
+        <w:t>Backend:</w:t>
       </w:r>
       <w:r>
         <w:rPr>
@@ -2612,23 +2519,7 @@
           <w:rStyle w:val="citation-56"/>
           <w:rFonts w:asciiTheme="minorHAnsi" w:hAnsiTheme="minorHAnsi" w:cstheme="minorHAnsi"/>
         </w:rPr>
-        <w:t xml:space="preserve">todo el sistema (Frontend + </w:t>
-      </w:r>
-      <w:proofErr w:type="spellStart"/>
-      <w:r>
-        <w:rPr>
-          <w:rStyle w:val="citation-56"/>
-          <w:rFonts w:asciiTheme="minorHAnsi" w:hAnsiTheme="minorHAnsi" w:cstheme="minorHAnsi"/>
-        </w:rPr>
-        <w:t>Backend</w:t>
-      </w:r>
-      <w:proofErr w:type="spellEnd"/>
-      <w:r>
-        <w:rPr>
-          <w:rStyle w:val="citation-56"/>
-          <w:rFonts w:asciiTheme="minorHAnsi" w:hAnsiTheme="minorHAnsi" w:cstheme="minorHAnsi"/>
-        </w:rPr>
-        <w:t xml:space="preserve"> + DB) en un solo conjunto de contenedores listos para ejecutarse en los servidores de la Contraloría</w:t>
+        <w:t>todo el sistema (Frontend + Backend + DB) en un solo conjunto de contenedores listos para ejecutarse en los servidores de la Contraloría</w:t>
       </w:r>
       <w:r>
         <w:rPr>
@@ -2805,23 +2696,7 @@
           <w:sz w:val="24"/>
           <w:szCs w:val="24"/>
         </w:rPr>
-        <w:t xml:space="preserve">Cada director de área redacta la respuesta y se </w:t>
-      </w:r>
-      <w:proofErr w:type="gramStart"/>
-      <w:r>
-        <w:rPr>
-          <w:sz w:val="24"/>
-          <w:szCs w:val="24"/>
-        </w:rPr>
-        <w:t>lo</w:t>
-      </w:r>
-      <w:proofErr w:type="gramEnd"/>
-      <w:r>
-        <w:rPr>
-          <w:sz w:val="24"/>
-          <w:szCs w:val="24"/>
-        </w:rPr>
-        <w:t xml:space="preserve"> da impreso a la contralora, esta le da el visto bueno para que posteriormente cada director le pase su respuesta al de TI.</w:t>
+        <w:t>Cada director de área redacta la respuesta y se lo da impreso a la contralora, esta le da el visto bueno para que posteriormente cada director le pase su respuesta al de TI.</w:t>
       </w:r>
     </w:p>
     <w:p>
@@ -3575,14 +3450,7 @@
               <w:rPr>
                 <w:lang w:val="es-ES"/>
               </w:rPr>
-              <w:t>El sistema muestra la GUI-</w:t>
-            </w:r>
-            <w:proofErr w:type="spellStart"/>
-            <w:r>
-              <w:rPr>
-                <w:lang w:val="es-ES"/>
-              </w:rPr>
-              <w:t>Iniciar</w:t>
+              <w:t>El sistema muestra la GUI-Iniciar</w:t>
             </w:r>
             <w:r>
               <w:rPr>
@@ -3606,14 +3474,7 @@
               <w:rPr>
                 <w:lang w:val="es-ES"/>
               </w:rPr>
-              <w:t>n</w:t>
-            </w:r>
-            <w:proofErr w:type="spellEnd"/>
-            <w:r>
-              <w:rPr>
-                <w:lang w:val="es-ES"/>
-              </w:rPr>
-              <w:t>, con el campo usuario, contraseña y los botones “Entrar</w:t>
+              <w:t>n, con el campo usuario, contraseña y los botones “Entrar</w:t>
             </w:r>
             <w:r>
               <w:rPr>
@@ -4717,7 +4578,6 @@
             <w:r>
               <w:t>El sistema muestra la GUI-</w:t>
             </w:r>
-            <w:proofErr w:type="spellStart"/>
             <w:r>
               <w:t>Gesti</w:t>
             </w:r>
@@ -4727,7 +4587,6 @@
             <w:r>
               <w:t>nSolicitudesTransparencia</w:t>
             </w:r>
-            <w:proofErr w:type="spellEnd"/>
             <w:r>
               <w:t xml:space="preserve">, </w:t>
             </w:r>
@@ -4927,13 +4786,8 @@
               <w:t>El sistema muestra una alerta que dice “El</w:t>
             </w:r>
             <w:r>
-              <w:t xml:space="preserve"> archivo seleccionado no es </w:t>
-            </w:r>
-            <w:proofErr w:type="spellStart"/>
-            <w:r>
-              <w:t>valido</w:t>
-            </w:r>
-            <w:proofErr w:type="spellEnd"/>
+              <w:t xml:space="preserve"> archivo seleccionado no es valido</w:t>
+            </w:r>
             <w:r>
               <w:t>”. </w:t>
             </w:r>
@@ -5812,11 +5666,9 @@
             <w:r>
               <w:t>El sistema muestra la GUI-</w:t>
             </w:r>
-            <w:proofErr w:type="spellStart"/>
             <w:r>
               <w:t>AsignacionSolicitud</w:t>
             </w:r>
-            <w:proofErr w:type="spellEnd"/>
             <w:r>
               <w:t xml:space="preserve"> y recupera de la base de datos una lista de l</w:t>
             </w:r>
@@ -6633,13 +6485,8 @@
             <w:hideMark/>
           </w:tcPr>
           <w:p>
-            <w:proofErr w:type="gramStart"/>
-            <w:r>
-              <w:t>El responsable carga</w:t>
-            </w:r>
-            <w:proofErr w:type="gramEnd"/>
-            <w:r>
-              <w:t xml:space="preserve"> al sistema un </w:t>
+            <w:r>
+              <w:t xml:space="preserve">El responsable carga al sistema un </w:t>
             </w:r>
             <w:r>
               <w:t>ARCHIVO</w:t>
@@ -7927,15 +7774,7 @@
               <w:t xml:space="preserve">El sistema </w:t>
             </w:r>
             <w:r>
-              <w:t>muestra la GUI-</w:t>
-            </w:r>
-            <w:proofErr w:type="spellStart"/>
-            <w:r>
-              <w:t>AutorizacionSolicitud</w:t>
-            </w:r>
-            <w:proofErr w:type="spellEnd"/>
-            <w:r>
-              <w:t xml:space="preserve"> con la lista </w:t>
+              <w:t xml:space="preserve">muestra la GUI-AutorizacionSolicitud con la lista </w:t>
             </w:r>
             <w:r>
               <w:t xml:space="preserve">recuperada de la base de datos </w:t>
@@ -8919,11 +8758,9 @@
             <w:r>
               <w:t>El sistema muestra la GUI-</w:t>
             </w:r>
-            <w:proofErr w:type="spellStart"/>
             <w:r>
               <w:t>VerRespuestaSolicitud</w:t>
             </w:r>
-            <w:proofErr w:type="spellEnd"/>
             <w:r>
               <w:t xml:space="preserve"> con la lista recuperada de la base de datos de ARCHIVO de la RESPUESTA. </w:t>
             </w:r>
@@ -11579,16 +11416,7 @@
           <w:bCs/>
           <w:sz w:val="24"/>
           <w:szCs w:val="24"/>
-        </w:rPr>
-      </w:pPr>
-    </w:p>
-    <w:p>
-      <w:pPr>
-        <w:rPr>
-          <w:b/>
-          <w:bCs/>
-          <w:sz w:val="24"/>
-          <w:szCs w:val="24"/>
+          <w:u w:val="single"/>
         </w:rPr>
       </w:pPr>
       <w:r>
@@ -11596,10 +11424,10 @@
           <w:noProof/>
         </w:rPr>
         <w:drawing>
-          <wp:inline distT="0" distB="0" distL="0" distR="0" wp14:anchorId="62A154E6" wp14:editId="04AF6600">
-            <wp:extent cx="5612130" cy="5078730"/>
-            <wp:effectExtent l="0" t="0" r="7620" b="7620"/>
-            <wp:docPr id="3" name="Imagen 3"/>
+          <wp:inline distT="0" distB="0" distL="0" distR="0" wp14:anchorId="76048B4A" wp14:editId="5D7D8CE5">
+            <wp:extent cx="5612130" cy="5073015"/>
+            <wp:effectExtent l="0" t="0" r="7620" b="0"/>
+            <wp:docPr id="8" name="Imagen 8"/>
             <wp:cNvGraphicFramePr>
               <a:graphicFrameLocks xmlns:a="http://schemas.openxmlformats.org/drawingml/2006/main" noChangeAspect="1"/>
             </wp:cNvGraphicFramePr>
@@ -11607,7 +11435,7 @@
               <a:graphicData uri="http://schemas.openxmlformats.org/drawingml/2006/picture">
                 <pic:pic xmlns:pic="http://schemas.openxmlformats.org/drawingml/2006/picture">
                   <pic:nvPicPr>
-                    <pic:cNvPr id="0" name="Picture 3"/>
+                    <pic:cNvPr id="0" name="Picture 7"/>
                     <pic:cNvPicPr>
                       <a:picLocks noChangeAspect="1" noChangeArrowheads="1"/>
                     </pic:cNvPicPr>
@@ -11628,7 +11456,7 @@
                   <pic:spPr bwMode="auto">
                     <a:xfrm>
                       <a:off x="0" y="0"/>
-                      <a:ext cx="5612130" cy="5078730"/>
+                      <a:ext cx="5612130" cy="5073015"/>
                     </a:xfrm>
                     <a:prstGeom prst="rect">
                       <a:avLst/>
@@ -11644,6 +11472,16 @@
           </wp:inline>
         </w:drawing>
       </w:r>
+    </w:p>
+    <w:p>
+      <w:pPr>
+        <w:rPr>
+          <w:b/>
+          <w:bCs/>
+          <w:sz w:val="24"/>
+          <w:szCs w:val="24"/>
+        </w:rPr>
+      </w:pPr>
     </w:p>
     <w:p>
       <w:pPr>
@@ -11763,25 +11601,15 @@
           <w:szCs w:val="24"/>
         </w:rPr>
       </w:pPr>
-    </w:p>
-    <w:p>
-      <w:pPr>
-        <w:rPr>
-          <w:b/>
-          <w:bCs/>
-          <w:sz w:val="24"/>
-          <w:szCs w:val="24"/>
-        </w:rPr>
-      </w:pPr>
       <w:r>
         <w:rPr>
           <w:noProof/>
         </w:rPr>
         <w:drawing>
-          <wp:inline distT="0" distB="0" distL="0" distR="0" wp14:anchorId="6C71BE33" wp14:editId="52F009AD">
-            <wp:extent cx="5612130" cy="3294380"/>
-            <wp:effectExtent l="0" t="0" r="7620" b="1270"/>
-            <wp:docPr id="4" name="Imagen 4"/>
+          <wp:inline distT="0" distB="0" distL="0" distR="0" wp14:anchorId="455055F5" wp14:editId="781BB5AE">
+            <wp:extent cx="5612130" cy="3295015"/>
+            <wp:effectExtent l="0" t="0" r="7620" b="635"/>
+            <wp:docPr id="7" name="Imagen 7"/>
             <wp:cNvGraphicFramePr>
               <a:graphicFrameLocks xmlns:a="http://schemas.openxmlformats.org/drawingml/2006/main" noChangeAspect="1"/>
             </wp:cNvGraphicFramePr>
@@ -11810,7 +11638,7 @@
                   <pic:spPr bwMode="auto">
                     <a:xfrm>
                       <a:off x="0" y="0"/>
-                      <a:ext cx="5612130" cy="3294380"/>
+                      <a:ext cx="5612130" cy="3295015"/>
                     </a:xfrm>
                     <a:prstGeom prst="rect">
                       <a:avLst/>

</xml_diff>